<commit_message>
Update Experiment Design field layout
</commit_message>
<xml_diff>
--- a/biochar_app/markdown/docx/experimentDesign.docx
+++ b/biochar_app/markdown/docx/experimentDesign.docx
@@ -185,11 +185,12 @@
         <w:rPr>
           <w:noProof/>
         </w:rPr>
+        <w:lastRenderedPageBreak/>
         <w:drawing>
-          <wp:inline distT="0" distB="0" distL="0" distR="0" wp14:anchorId="68BE07D6" wp14:editId="212274D4">
-            <wp:extent cx="1972903" cy="3096142"/>
-            <wp:effectExtent l="0" t="0" r="0" b="3175"/>
-            <wp:docPr id="1840529377" name="Picture 1"/>
+          <wp:inline distT="0" distB="0" distL="0" distR="0" wp14:anchorId="6309D7DD" wp14:editId="68720D5B">
+            <wp:extent cx="4000500" cy="6400800"/>
+            <wp:effectExtent l="0" t="0" r="0" b="0"/>
+            <wp:docPr id="691907995" name="Picture 1"/>
             <wp:cNvGraphicFramePr>
               <a:graphicFrameLocks xmlns:a="http://schemas.openxmlformats.org/drawingml/2006/main" noChangeAspect="1"/>
             </wp:cNvGraphicFramePr>
@@ -197,7 +198,7 @@
               <a:graphicData uri="http://schemas.openxmlformats.org/drawingml/2006/picture">
                 <pic:pic xmlns:pic="http://schemas.openxmlformats.org/drawingml/2006/picture">
                   <pic:nvPicPr>
-                    <pic:cNvPr id="1840529377" name="Picture 1"/>
+                    <pic:cNvPr id="691907995" name="Picture 691907995"/>
                     <pic:cNvPicPr/>
                   </pic:nvPicPr>
                   <pic:blipFill>
@@ -215,7 +216,7 @@
                   <pic:spPr>
                     <a:xfrm>
                       <a:off x="0" y="0"/>
-                      <a:ext cx="1972903" cy="3096142"/>
+                      <a:ext cx="4000500" cy="6400800"/>
                     </a:xfrm>
                     <a:prstGeom prst="rect">
                       <a:avLst/>
@@ -278,7 +279,6 @@
         <w:pStyle w:val="Heading2"/>
       </w:pPr>
       <w:r>
-        <w:lastRenderedPageBreak/>
         <w:t>Irrigation</w:t>
       </w:r>
       <w:r>
@@ -324,7 +324,11 @@
         <w:t xml:space="preserve">. Water is applied </w:t>
       </w:r>
       <w:r>
-        <w:t>using furrow irrigation, with the furrows 30 inches apart. Irrigation water is applied at the north end (top of the image) and runs down the furrows, infiltrating into the soil</w:t>
+        <w:t xml:space="preserve">using furrow irrigation, with the furrows 30 inches apart. Irrigation water is applied at the north end (top of the image) </w:t>
+      </w:r>
+      <w:r>
+        <w:lastRenderedPageBreak/>
+        <w:t>and runs down the furrows, infiltrating into the soil</w:t>
       </w:r>
       <w:r>
         <w:t xml:space="preserve"> (see figure below).</w:t>
@@ -461,10 +465,7 @@
         <w:keepNext/>
       </w:pPr>
       <w:r>
-        <w:t xml:space="preserve">Data on the consequences of irrigation in soil </w:t>
-      </w:r>
-      <w:r>
-        <w:t xml:space="preserve">– </w:t>
+        <w:t xml:space="preserve">Data on the consequences of irrigation in soil – </w:t>
       </w:r>
       <w:r>
         <w:t xml:space="preserve">soil moisture, bulk electrical conductivity (bulk EC), and temperature </w:t>
@@ -496,6 +497,9 @@
         <w:keepNext/>
       </w:pPr>
       <w:r>
+        <w:rPr>
+          <w:noProof/>
+        </w:rPr>
         <w:drawing>
           <wp:inline distT="0" distB="0" distL="0" distR="0" wp14:anchorId="38B7C73B" wp14:editId="69B0F41B">
             <wp:extent cx="2267028" cy="2992476"/>
@@ -1461,6 +1465,7 @@
   <w:style w:type="character" w:default="1" w:styleId="DefaultParagraphFont">
     <w:name w:val="Default Paragraph Font"/>
     <w:uiPriority w:val="1"/>
+    <w:semiHidden/>
     <w:unhideWhenUsed/>
   </w:style>
   <w:style w:type="table" w:default="1" w:styleId="TableNormal">

</xml_diff>